<commit_message>
HA reviewer fixes: small-cluster t(G-1), Holm multiplicity, soften claims, STROBE, public-repo sync
Co-Authored-By: Tatsuki Onishi <bougtoir@gmail.com>
</commit_message>
<xml_diff>
--- a/medical_accident_its_analysis/manuscript/ha_cover_letter.docx
+++ b/medical_accident_its_analysis/manuscript/ha_cover_letter.docx
@@ -70,7 +70,7 @@
           <w:rFonts w:ascii="Times New Roman" w:hAnsi="Times New Roman"/>
           <w:sz w:val="22"/>
         </w:rPr>
-        <w:t>Healthcare Analytics promotes the application of data science, statistics, operations research and mathematical modelling to decision-making in healthcare organisations. Our study applies these tools to a long-standing workforce-policy question: whether malpractice-litigation risk drives physicians away from high-risk specialties.</w:t>
+        <w:t>Healthcare Analytics advances data-driven analytics for healthcare decisions. Our study applies a transparent, reproducible health-analytics pipeline to a long-standing workforce-policy question: whether malpractice-litigation risk drives physicians away from high-risk specialties.</w:t>
       </w:r>
     </w:p>
     <w:p>
@@ -94,7 +94,7 @@
           <w:rFonts w:ascii="Times New Roman" w:hAnsi="Times New Roman"/>
           <w:sz w:val="22"/>
         </w:rPr>
-        <w:t>All data and code are openly available and every reported number is reproducible from the raw primary files in the accompanying repository.</w:t>
+        <w:t>All data and code are openly available in the project repository (https://github.com/bougtoir/medical-accident-its-analysis) and every reported number is reproducible from the raw primary files.</w:t>
       </w:r>
     </w:p>
     <w:p>

</xml_diff>

<commit_message>
HA: reframe as global workforce-allocation test case using Japan national data
Co-Authored-By: Tatsuki Onishi <bougtoir@gmail.com>
</commit_message>
<xml_diff>
--- a/medical_accident_its_analysis/manuscript/ha_cover_letter.docx
+++ b/medical_accident_its_analysis/manuscript/ha_cover_letter.docx
@@ -58,7 +58,7 @@
           <w:rFonts w:ascii="Times New Roman" w:hAnsi="Times New Roman"/>
           <w:sz w:val="22"/>
         </w:rPr>
-        <w:t>We submit an original research article, "Litigation risk and specialty-level physician workforce allocation in Japan, 2008–2024: a sensitivity-analysis framework with equivalence testing", for consideration by Healthcare Analytics.</w:t>
+        <w:t>We submit an original research article, "Litigation risk and specialty-level physician workforce allocation: a sensitivity-analysis framework with equivalence testing", for consideration by Healthcare Analytics.</w:t>
       </w:r>
     </w:p>
     <w:p>
@@ -82,7 +82,7 @@
           <w:rFonts w:ascii="Times New Roman" w:hAnsi="Times New Roman"/>
           <w:sz w:val="22"/>
         </w:rPr>
-        <w:t>Using national primary data for 12 clinical specialties in Japan, we measure exposure as a size-adjusted rate (closed malpractice claims per 1,000 physicians) and estimate panel fixed-effects models with equivalence (TOST) testing. The effect of litigation risk on physician and hospital growth is statistically equivalent to a null within policy-relevant margins. We show that count-based associations disappear once specialty-size confounding and interpolation are removed, and we discuss how structural incentives—notably no-fault obstetric compensation—may sustain the specialty workforce.</w:t>
+        <w:t>The national administrative data we use come from Japan, a setting that provides a complete, long-running test case. Using national primary data for 12 clinical specialties, we measure exposure as a size-adjusted rate (closed malpractice claims per 1,000 physicians) and estimate panel fixed-effects models with equivalence (TOST) testing. The effect of litigation risk on physician and hospital growth is statistically equivalent to a null within policy-relevant margins. We show that count-based associations disappear once specialty-size confounding and interpolation are removed, and we discuss how structural incentives—notably no-fault obstetric compensation—may sustain the specialty workforce.</w:t>
       </w:r>
     </w:p>
     <w:p>

</xml_diff>

<commit_message>
HA: add bootstrap/power diagnostics, decision-analytics framing, negative-result interpretation, behavioral-economics discussion, and endogeneity/generalizability caveats
Co-Authored-By: Tatsuki Onishi <bougtoir@gmail.com>
</commit_message>
<xml_diff>
--- a/medical_accident_its_analysis/manuscript/ha_cover_letter.docx
+++ b/medical_accident_its_analysis/manuscript/ha_cover_letter.docx
@@ -58,7 +58,7 @@
           <w:rFonts w:ascii="Times New Roman" w:hAnsi="Times New Roman"/>
           <w:sz w:val="22"/>
         </w:rPr>
-        <w:t>We submit an original research article, "Litigation risk and specialty-level physician workforce allocation: a sensitivity-analysis framework with equivalence testing", for consideration by Healthcare Analytics.</w:t>
+        <w:t>We submit an original research article, "Litigation risk and specialty-level physician workforce allocation: a transparent decision-analytics framework for evaluating healthcare workforce policy levers", for consideration by Healthcare Analytics.</w:t>
       </w:r>
     </w:p>
     <w:p>
@@ -70,7 +70,7 @@
           <w:rFonts w:ascii="Times New Roman" w:hAnsi="Times New Roman"/>
           <w:sz w:val="22"/>
         </w:rPr>
-        <w:t>Healthcare Analytics advances data-driven analytics for healthcare decisions. Our study treats specialty physician workforce planning as a healthcare resource-allocation problem and uses it as a test case for a transparent, reproducible sensitivity-analysis framework. The analytical contribution is diagnostic: we show how two common observational fallacies—size confounding and interpolation of sparse panel data—can be identified and removed when a proposed policy lever (malpractice-litigation risk) is evaluated against physician workforce outcomes.</w:t>
+        <w:t>Healthcare Analytics advances data-driven analytics and operations research for healthcare decisions. Our study treats specialty physician workforce planning as a healthcare resource-allocation problem and uses the litigation-workforce question as a test case for a transparent, reproducible decision-analytics framework. The analytical contribution is diagnostic: we show how two common observational fallacies—size confounding and interpolation of sparse panel data—can be identified and removed when a proposed policy lever (malpractice-litigation risk) is evaluated against workforce outcomes, and we add cluster block-bootstrap and power diagnostics to the standard fixed-effects / equivalence-testing toolkit.</w:t>
       </w:r>
     </w:p>
     <w:p>
@@ -82,7 +82,7 @@
           <w:rFonts w:ascii="Times New Roman" w:hAnsi="Times New Roman"/>
           <w:sz w:val="22"/>
         </w:rPr>
-        <w:t>The national administrative data we use come from Japan, a setting that provides a complete, long-running test case. Using national primary data for 12 clinical specialties, we measure exposure as a size-adjusted rate (closed malpractice claims per 1,000 physicians) and estimate panel fixed-effects models with equivalence (TOST) testing. The effect of litigation risk on physician and hospital growth is statistically equivalent to a null within policy-relevant margins. We show that count-based associations disappear once specialty-size confounding and interpolation are removed, and we discuss how structural incentives—notably no-fault obstetric compensation—may sustain the specialty workforce.</w:t>
+        <w:t>The national administrative data we use come from Japan, a setting that provides a complete, long-running test case. Using national primary data for 12 clinical specialties, we measure exposure as a size-adjusted rate (closed malpractice claims per 1,000 physicians) and estimate panel fixed-effects models with small-cluster inference, equivalence (TOST) testing, and bootstrap robustness checks. The effect of litigation risk on physician and hospital growth is statistically equivalent to a null within policy-relevant margins. We show that count-based associations disappear once specialty-size confounding and interpolation are removed, and we discuss how behavioural-economics mechanisms (saliency, loss aversion, status-quo bias) and structural incentives—notably no-fault obstetric compensation—may sustain the specialty workforce.</w:t>
       </w:r>
     </w:p>
     <w:p>

</xml_diff>